<commit_message>
Step 2 - Bootstrap
created js file and bootstrapped the program
حمّل SAPUI5 Core وشغّل الـUI5 framework.
</commit_message>
<xml_diff>
--- a/SAP Basics.docx
+++ b/SAP Basics.docx
@@ -26,13 +26,39 @@
         </w:rPr>
         <w:t xml:space="preserve"> </w:t>
       </w:r>
-      <w:r>
-        <w:rPr>
-          <w:b/>
-          <w:bCs/>
-        </w:rPr>
-        <w:t>https://www.youtube.com/watch?v=C9cK2Z2JDLg</w:t>
-      </w:r>
+      <w:hyperlink r:id="rId5" w:history="1">
+        <w:r>
+          <w:rPr>
+            <w:rStyle w:val="Hyperlink"/>
+            <w:b/>
+            <w:bCs/>
+          </w:rPr>
+          <w:t>https://www.youtube.com/watch?v=C9cK2Z2JDLg</w:t>
+        </w:r>
+      </w:hyperlink>
+    </w:p>
+    <w:p>
+      <w:proofErr w:type="spellStart"/>
+      <w:r>
+        <w:t>Github</w:t>
+      </w:r>
+      <w:proofErr w:type="spellEnd"/>
+      <w:r>
+        <w:t xml:space="preserve"> documentation : </w:t>
+      </w:r>
+      <w:hyperlink r:id="rId6" w:tgtFrame="_blank" w:history="1">
+        <w:r>
+          <w:rPr>
+            <w:rStyle w:val="Hyperlink"/>
+            <w:rFonts w:ascii="Arial" w:hAnsi="Arial" w:cs="Arial"/>
+            <w:sz w:val="21"/>
+            <w:szCs w:val="21"/>
+          </w:rPr>
+          <w:t>https://github.com/brandoncaulfield/s...</w:t>
+        </w:r>
+      </w:hyperlink>
+      <w:bookmarkStart w:id="0" w:name="_GoBack"/>
+      <w:bookmarkEnd w:id="0"/>
     </w:p>
     <w:p>
       <w:pPr>
@@ -563,7 +589,7 @@
         </w:rPr>
         <w:t xml:space="preserve">copy paste sample code here </w:t>
       </w:r>
-      <w:hyperlink r:id="rId5" w:history="1">
+      <w:hyperlink r:id="rId7" w:anchor="/topic/be0cf40f61184b358b5faedaec98b2da" w:history="1">
         <w:r>
           <w:rPr>
             <w:rStyle w:val="Hyperlink"/>
@@ -583,9 +609,8 @@
           <w:szCs w:val="28"/>
           <w:shd w:val="clear" w:color="auto" w:fill="F5F5F5"/>
         </w:rPr>
-        <w:t xml:space="preserve"> and change </w:t>
-      </w:r>
-      <w:proofErr w:type="spellStart"/>
+        <w:t xml:space="preserve"> and change err</w:t>
+      </w:r>
       <w:r>
         <w:rPr>
           <w:rFonts w:asciiTheme="minorBidi" w:eastAsia="Times New Roman" w:hAnsiTheme="minorBidi"/>
@@ -594,20 +619,9 @@
           <w:szCs w:val="28"/>
           <w:shd w:val="clear" w:color="auto" w:fill="F5F5F5"/>
         </w:rPr>
-        <w:t>eroors</w:t>
-      </w:r>
-      <w:proofErr w:type="spellEnd"/>
-      <w:r>
-        <w:rPr>
-          <w:rFonts w:asciiTheme="minorBidi" w:eastAsia="Times New Roman" w:hAnsiTheme="minorBidi"/>
-          <w:color w:val="36464E"/>
-          <w:sz w:val="28"/>
-          <w:szCs w:val="28"/>
-          <w:shd w:val="clear" w:color="auto" w:fill="F5F5F5"/>
-        </w:rPr>
-        <w:t xml:space="preserve"> or copy this (</w:t>
-      </w:r>
-      <w:hyperlink r:id="rId6" w:history="1">
+        <w:t>ors or copy this (</w:t>
+      </w:r>
+      <w:hyperlink r:id="rId8" w:anchor="diff-55c2b5a1ba727235d1d642c9abd37d45992cc61e075993df1a69df791fbbeb15" w:history="1">
         <w:r>
           <w:rPr>
             <w:rStyle w:val="Hyperlink"/>
@@ -666,26 +680,6 @@
     </w:p>
     <w:p>
       <w:pPr>
-        <w:shd w:val="clear" w:color="auto" w:fill="FFFFFF"/>
-        <w:tabs>
-          <w:tab w:val="left" w:pos="916"/>
-          <w:tab w:val="left" w:pos="1832"/>
-          <w:tab w:val="left" w:pos="2748"/>
-          <w:tab w:val="left" w:pos="3664"/>
-          <w:tab w:val="left" w:pos="4580"/>
-          <w:tab w:val="left" w:pos="5496"/>
-          <w:tab w:val="left" w:pos="6412"/>
-          <w:tab w:val="left" w:pos="7328"/>
-          <w:tab w:val="left" w:pos="8244"/>
-          <w:tab w:val="left" w:pos="9160"/>
-          <w:tab w:val="left" w:pos="10076"/>
-          <w:tab w:val="left" w:pos="10992"/>
-          <w:tab w:val="left" w:pos="11908"/>
-          <w:tab w:val="left" w:pos="12824"/>
-          <w:tab w:val="left" w:pos="13740"/>
-          <w:tab w:val="left" w:pos="14656"/>
-        </w:tabs>
-        <w:spacing w:after="0" w:line="240" w:lineRule="auto"/>
         <w:rPr>
           <w:rFonts w:asciiTheme="minorBidi" w:eastAsia="Times New Roman" w:hAnsiTheme="minorBidi"/>
           <w:color w:val="36464E"/>
@@ -694,29 +688,20 @@
           <w:shd w:val="clear" w:color="auto" w:fill="F5F5F5"/>
         </w:rPr>
       </w:pPr>
+      <w:r>
+        <w:rPr>
+          <w:rFonts w:asciiTheme="minorBidi" w:eastAsia="Times New Roman" w:hAnsiTheme="minorBidi"/>
+          <w:color w:val="36464E"/>
+          <w:sz w:val="28"/>
+          <w:szCs w:val="28"/>
+          <w:shd w:val="clear" w:color="auto" w:fill="F5F5F5"/>
+        </w:rPr>
+        <w:t>Now we have everything all setup</w:t>
+      </w:r>
     </w:p>
     <w:p>
       <w:pPr>
-        <w:shd w:val="clear" w:color="auto" w:fill="FFFFFF"/>
-        <w:tabs>
-          <w:tab w:val="left" w:pos="916"/>
-          <w:tab w:val="left" w:pos="1832"/>
-          <w:tab w:val="left" w:pos="2748"/>
-          <w:tab w:val="left" w:pos="3664"/>
-          <w:tab w:val="left" w:pos="4580"/>
-          <w:tab w:val="left" w:pos="5496"/>
-          <w:tab w:val="left" w:pos="6412"/>
-          <w:tab w:val="left" w:pos="7328"/>
-          <w:tab w:val="left" w:pos="8244"/>
-          <w:tab w:val="left" w:pos="9160"/>
-          <w:tab w:val="left" w:pos="10076"/>
-          <w:tab w:val="left" w:pos="10992"/>
-          <w:tab w:val="left" w:pos="11908"/>
-          <w:tab w:val="left" w:pos="12824"/>
-          <w:tab w:val="left" w:pos="13740"/>
-          <w:tab w:val="left" w:pos="14656"/>
-        </w:tabs>
-        <w:spacing w:after="0" w:line="240" w:lineRule="auto"/>
+        <w:jc w:val="center"/>
         <w:rPr>
           <w:rFonts w:asciiTheme="minorBidi" w:eastAsia="Times New Roman" w:hAnsiTheme="minorBidi"/>
           <w:color w:val="36464E"/>
@@ -725,18 +710,197 @@
           <w:shd w:val="clear" w:color="auto" w:fill="F5F5F5"/>
         </w:rPr>
       </w:pPr>
+      <w:r>
+        <w:rPr>
+          <w:rFonts w:asciiTheme="minorBidi" w:eastAsia="Times New Roman" w:hAnsiTheme="minorBidi"/>
+          <w:color w:val="36464E"/>
+          <w:sz w:val="28"/>
+          <w:szCs w:val="28"/>
+          <w:shd w:val="clear" w:color="auto" w:fill="F5F5F5"/>
+        </w:rPr>
+        <w:t>Step 1 – Hello World</w:t>
+      </w:r>
     </w:p>
-    <w:p/>
     <w:p>
       <w:pPr>
-        <w:pStyle w:val="Heading1"/>
-        <w:rPr>
-          <w:b/>
-          <w:bCs/>
-        </w:rPr>
-      </w:pPr>
-      <w:bookmarkStart w:id="0" w:name="_GoBack"/>
-      <w:bookmarkEnd w:id="0"/>
+        <w:pStyle w:val="ListParagraph"/>
+        <w:numPr>
+          <w:ilvl w:val="0"/>
+          <w:numId w:val="7"/>
+        </w:numPr>
+        <w:spacing w:after="0"/>
+        <w:rPr>
+          <w:rFonts w:asciiTheme="minorBidi" w:hAnsiTheme="minorBidi"/>
+          <w:color w:val="C45911" w:themeColor="accent2" w:themeShade="BF"/>
+          <w:sz w:val="28"/>
+          <w:szCs w:val="28"/>
+        </w:rPr>
+      </w:pPr>
+      <w:r>
+        <w:rPr>
+          <w:rFonts w:asciiTheme="minorBidi" w:hAnsiTheme="minorBidi"/>
+          <w:color w:val="C45911" w:themeColor="accent2" w:themeShade="BF"/>
+          <w:sz w:val="28"/>
+          <w:szCs w:val="28"/>
+        </w:rPr>
+        <w:t xml:space="preserve">Inside </w:t>
+      </w:r>
+      <w:proofErr w:type="spellStart"/>
+      <w:r>
+        <w:rPr>
+          <w:rFonts w:asciiTheme="minorBidi" w:hAnsiTheme="minorBidi"/>
+          <w:color w:val="C45911" w:themeColor="accent2" w:themeShade="BF"/>
+          <w:sz w:val="28"/>
+          <w:szCs w:val="28"/>
+        </w:rPr>
+        <w:t>webapp</w:t>
+      </w:r>
+      <w:proofErr w:type="spellEnd"/>
+      <w:r>
+        <w:rPr>
+          <w:rFonts w:asciiTheme="minorBidi" w:hAnsiTheme="minorBidi"/>
+          <w:color w:val="C45911" w:themeColor="accent2" w:themeShade="BF"/>
+          <w:sz w:val="28"/>
+          <w:szCs w:val="28"/>
+        </w:rPr>
+        <w:t xml:space="preserve"> folder create index.html file and write Hello world </w:t>
+      </w:r>
+    </w:p>
+    <w:p>
+      <w:pPr>
+        <w:pBdr>
+          <w:bottom w:val="double" w:sz="6" w:space="1" w:color="auto"/>
+        </w:pBdr>
+        <w:ind w:left="360"/>
+        <w:rPr>
+          <w:rFonts w:asciiTheme="minorBidi" w:hAnsiTheme="minorBidi"/>
+          <w:color w:val="767171" w:themeColor="background2" w:themeShade="80"/>
+          <w:sz w:val="28"/>
+          <w:szCs w:val="28"/>
+        </w:rPr>
+      </w:pPr>
+      <w:proofErr w:type="gramStart"/>
+      <w:r>
+        <w:rPr>
+          <w:rFonts w:asciiTheme="minorBidi" w:hAnsiTheme="minorBidi"/>
+          <w:color w:val="767171" w:themeColor="background2" w:themeShade="80"/>
+          <w:sz w:val="28"/>
+          <w:szCs w:val="28"/>
+        </w:rPr>
+        <w:t>P.S :</w:t>
+      </w:r>
+      <w:proofErr w:type="gramEnd"/>
+      <w:r>
+        <w:rPr>
+          <w:rFonts w:asciiTheme="minorBidi" w:hAnsiTheme="minorBidi"/>
+          <w:color w:val="767171" w:themeColor="background2" w:themeShade="80"/>
+          <w:sz w:val="28"/>
+          <w:szCs w:val="28"/>
+        </w:rPr>
+        <w:t xml:space="preserve"> TO test it write in terminal (ui5 serve)</w:t>
+      </w:r>
+    </w:p>
+    <w:p>
+      <w:pPr>
+        <w:jc w:val="center"/>
+        <w:rPr>
+          <w:rFonts w:asciiTheme="minorBidi" w:eastAsia="Times New Roman" w:hAnsiTheme="minorBidi"/>
+          <w:color w:val="36464E"/>
+          <w:sz w:val="28"/>
+          <w:szCs w:val="28"/>
+          <w:shd w:val="clear" w:color="auto" w:fill="F5F5F5"/>
+        </w:rPr>
+      </w:pPr>
+      <w:r>
+        <w:rPr>
+          <w:rFonts w:asciiTheme="minorBidi" w:eastAsia="Times New Roman" w:hAnsiTheme="minorBidi"/>
+          <w:color w:val="36464E"/>
+          <w:sz w:val="28"/>
+          <w:szCs w:val="28"/>
+          <w:shd w:val="clear" w:color="auto" w:fill="F5F5F5"/>
+        </w:rPr>
+        <w:t xml:space="preserve">Step </w:t>
+      </w:r>
+      <w:r>
+        <w:rPr>
+          <w:rFonts w:asciiTheme="minorBidi" w:eastAsia="Times New Roman" w:hAnsiTheme="minorBidi"/>
+          <w:color w:val="36464E"/>
+          <w:sz w:val="28"/>
+          <w:szCs w:val="28"/>
+          <w:shd w:val="clear" w:color="auto" w:fill="F5F5F5"/>
+        </w:rPr>
+        <w:t>2 – Bootstrap</w:t>
+      </w:r>
+    </w:p>
+    <w:p>
+      <w:pPr>
+        <w:pStyle w:val="ListParagraph"/>
+        <w:numPr>
+          <w:ilvl w:val="0"/>
+          <w:numId w:val="8"/>
+        </w:numPr>
+        <w:rPr>
+          <w:rFonts w:asciiTheme="minorBidi" w:eastAsia="Times New Roman" w:hAnsiTheme="minorBidi"/>
+          <w:color w:val="36464E"/>
+          <w:sz w:val="28"/>
+          <w:szCs w:val="28"/>
+          <w:shd w:val="clear" w:color="auto" w:fill="F5F5F5"/>
+        </w:rPr>
+      </w:pPr>
+      <w:r>
+        <w:rPr>
+          <w:rFonts w:asciiTheme="minorBidi" w:eastAsia="Times New Roman" w:hAnsiTheme="minorBidi"/>
+          <w:color w:val="36464E"/>
+          <w:sz w:val="28"/>
+          <w:szCs w:val="28"/>
+          <w:shd w:val="clear" w:color="auto" w:fill="F5F5F5"/>
+        </w:rPr>
+        <w:t xml:space="preserve">Paste the </w:t>
+      </w:r>
+      <w:proofErr w:type="spellStart"/>
+      <w:r>
+        <w:rPr>
+          <w:rFonts w:asciiTheme="minorBidi" w:eastAsia="Times New Roman" w:hAnsiTheme="minorBidi"/>
+          <w:color w:val="36464E"/>
+          <w:sz w:val="28"/>
+          <w:szCs w:val="28"/>
+          <w:shd w:val="clear" w:color="auto" w:fill="F5F5F5"/>
+        </w:rPr>
+        <w:t>js</w:t>
+      </w:r>
+      <w:proofErr w:type="spellEnd"/>
+      <w:r>
+        <w:rPr>
+          <w:rFonts w:asciiTheme="minorBidi" w:eastAsia="Times New Roman" w:hAnsiTheme="minorBidi"/>
+          <w:color w:val="36464E"/>
+          <w:sz w:val="28"/>
+          <w:szCs w:val="28"/>
+          <w:shd w:val="clear" w:color="auto" w:fill="F5F5F5"/>
+        </w:rPr>
+        <w:t xml:space="preserve"> </w:t>
+      </w:r>
+      <w:r>
+        <w:rPr>
+          <w:rFonts w:asciiTheme="minorBidi" w:eastAsia="Times New Roman" w:hAnsiTheme="minorBidi"/>
+          <w:color w:val="36464E"/>
+          <w:sz w:val="28"/>
+          <w:szCs w:val="28"/>
+          <w:shd w:val="clear" w:color="auto" w:fill="F5F5F5"/>
+        </w:rPr>
+        <w:t xml:space="preserve">code in the documentation </w:t>
+      </w:r>
+    </w:p>
+    <w:p>
+      <w:pPr>
+        <w:ind w:left="360"/>
+        <w:jc w:val="center"/>
+        <w:rPr>
+          <w:rFonts w:asciiTheme="minorBidi" w:hAnsiTheme="minorBidi"/>
+          <w:color w:val="767171" w:themeColor="background2" w:themeShade="80"/>
+          <w:sz w:val="28"/>
+          <w:szCs w:val="28"/>
+        </w:rPr>
+      </w:pPr>
     </w:p>
     <w:sectPr>
       <w:pgSz w:w="12240" w:h="15840"/>
@@ -977,6 +1141,184 @@
     </w:lvl>
   </w:abstractNum>
   <w:abstractNum w:abstractNumId="2" w15:restartNumberingAfterBreak="0">
+    <w:nsid w:val="280C0D41"/>
+    <w:multiLevelType w:val="hybridMultilevel"/>
+    <w:tmpl w:val="90628D48"/>
+    <w:lvl w:ilvl="0" w:tplc="74C2A2AE">
+      <w:start w:val="1"/>
+      <w:numFmt w:val="decimal"/>
+      <w:lvlText w:val="%1-"/>
+      <w:lvlJc w:val="left"/>
+      <w:pPr>
+        <w:ind w:left="720" w:hanging="360"/>
+      </w:pPr>
+      <w:rPr>
+        <w:rFonts w:hint="default"/>
+      </w:rPr>
+    </w:lvl>
+    <w:lvl w:ilvl="1" w:tplc="04090019" w:tentative="1">
+      <w:start w:val="1"/>
+      <w:numFmt w:val="lowerLetter"/>
+      <w:lvlText w:val="%2."/>
+      <w:lvlJc w:val="left"/>
+      <w:pPr>
+        <w:ind w:left="1440" w:hanging="360"/>
+      </w:pPr>
+    </w:lvl>
+    <w:lvl w:ilvl="2" w:tplc="0409001B" w:tentative="1">
+      <w:start w:val="1"/>
+      <w:numFmt w:val="lowerRoman"/>
+      <w:lvlText w:val="%3."/>
+      <w:lvlJc w:val="right"/>
+      <w:pPr>
+        <w:ind w:left="2160" w:hanging="180"/>
+      </w:pPr>
+    </w:lvl>
+    <w:lvl w:ilvl="3" w:tplc="0409000F" w:tentative="1">
+      <w:start w:val="1"/>
+      <w:numFmt w:val="decimal"/>
+      <w:lvlText w:val="%4."/>
+      <w:lvlJc w:val="left"/>
+      <w:pPr>
+        <w:ind w:left="2880" w:hanging="360"/>
+      </w:pPr>
+    </w:lvl>
+    <w:lvl w:ilvl="4" w:tplc="04090019" w:tentative="1">
+      <w:start w:val="1"/>
+      <w:numFmt w:val="lowerLetter"/>
+      <w:lvlText w:val="%5."/>
+      <w:lvlJc w:val="left"/>
+      <w:pPr>
+        <w:ind w:left="3600" w:hanging="360"/>
+      </w:pPr>
+    </w:lvl>
+    <w:lvl w:ilvl="5" w:tplc="0409001B" w:tentative="1">
+      <w:start w:val="1"/>
+      <w:numFmt w:val="lowerRoman"/>
+      <w:lvlText w:val="%6."/>
+      <w:lvlJc w:val="right"/>
+      <w:pPr>
+        <w:ind w:left="4320" w:hanging="180"/>
+      </w:pPr>
+    </w:lvl>
+    <w:lvl w:ilvl="6" w:tplc="0409000F" w:tentative="1">
+      <w:start w:val="1"/>
+      <w:numFmt w:val="decimal"/>
+      <w:lvlText w:val="%7."/>
+      <w:lvlJc w:val="left"/>
+      <w:pPr>
+        <w:ind w:left="5040" w:hanging="360"/>
+      </w:pPr>
+    </w:lvl>
+    <w:lvl w:ilvl="7" w:tplc="04090019" w:tentative="1">
+      <w:start w:val="1"/>
+      <w:numFmt w:val="lowerLetter"/>
+      <w:lvlText w:val="%8."/>
+      <w:lvlJc w:val="left"/>
+      <w:pPr>
+        <w:ind w:left="5760" w:hanging="360"/>
+      </w:pPr>
+    </w:lvl>
+    <w:lvl w:ilvl="8" w:tplc="0409001B" w:tentative="1">
+      <w:start w:val="1"/>
+      <w:numFmt w:val="lowerRoman"/>
+      <w:lvlText w:val="%9."/>
+      <w:lvlJc w:val="right"/>
+      <w:pPr>
+        <w:ind w:left="6480" w:hanging="180"/>
+      </w:pPr>
+    </w:lvl>
+  </w:abstractNum>
+  <w:abstractNum w:abstractNumId="3" w15:restartNumberingAfterBreak="0">
+    <w:nsid w:val="3DBA365A"/>
+    <w:multiLevelType w:val="hybridMultilevel"/>
+    <w:tmpl w:val="AB2658DC"/>
+    <w:lvl w:ilvl="0" w:tplc="68F884A8">
+      <w:start w:val="1"/>
+      <w:numFmt w:val="decimal"/>
+      <w:lvlText w:val="%1-"/>
+      <w:lvlJc w:val="left"/>
+      <w:pPr>
+        <w:ind w:left="720" w:hanging="360"/>
+      </w:pPr>
+      <w:rPr>
+        <w:rFonts w:hint="default"/>
+      </w:rPr>
+    </w:lvl>
+    <w:lvl w:ilvl="1" w:tplc="04090019" w:tentative="1">
+      <w:start w:val="1"/>
+      <w:numFmt w:val="lowerLetter"/>
+      <w:lvlText w:val="%2."/>
+      <w:lvlJc w:val="left"/>
+      <w:pPr>
+        <w:ind w:left="1440" w:hanging="360"/>
+      </w:pPr>
+    </w:lvl>
+    <w:lvl w:ilvl="2" w:tplc="0409001B" w:tentative="1">
+      <w:start w:val="1"/>
+      <w:numFmt w:val="lowerRoman"/>
+      <w:lvlText w:val="%3."/>
+      <w:lvlJc w:val="right"/>
+      <w:pPr>
+        <w:ind w:left="2160" w:hanging="180"/>
+      </w:pPr>
+    </w:lvl>
+    <w:lvl w:ilvl="3" w:tplc="0409000F" w:tentative="1">
+      <w:start w:val="1"/>
+      <w:numFmt w:val="decimal"/>
+      <w:lvlText w:val="%4."/>
+      <w:lvlJc w:val="left"/>
+      <w:pPr>
+        <w:ind w:left="2880" w:hanging="360"/>
+      </w:pPr>
+    </w:lvl>
+    <w:lvl w:ilvl="4" w:tplc="04090019" w:tentative="1">
+      <w:start w:val="1"/>
+      <w:numFmt w:val="lowerLetter"/>
+      <w:lvlText w:val="%5."/>
+      <w:lvlJc w:val="left"/>
+      <w:pPr>
+        <w:ind w:left="3600" w:hanging="360"/>
+      </w:pPr>
+    </w:lvl>
+    <w:lvl w:ilvl="5" w:tplc="0409001B" w:tentative="1">
+      <w:start w:val="1"/>
+      <w:numFmt w:val="lowerRoman"/>
+      <w:lvlText w:val="%6."/>
+      <w:lvlJc w:val="right"/>
+      <w:pPr>
+        <w:ind w:left="4320" w:hanging="180"/>
+      </w:pPr>
+    </w:lvl>
+    <w:lvl w:ilvl="6" w:tplc="0409000F" w:tentative="1">
+      <w:start w:val="1"/>
+      <w:numFmt w:val="decimal"/>
+      <w:lvlText w:val="%7."/>
+      <w:lvlJc w:val="left"/>
+      <w:pPr>
+        <w:ind w:left="5040" w:hanging="360"/>
+      </w:pPr>
+    </w:lvl>
+    <w:lvl w:ilvl="7" w:tplc="04090019" w:tentative="1">
+      <w:start w:val="1"/>
+      <w:numFmt w:val="lowerLetter"/>
+      <w:lvlText w:val="%8."/>
+      <w:lvlJc w:val="left"/>
+      <w:pPr>
+        <w:ind w:left="5760" w:hanging="360"/>
+      </w:pPr>
+    </w:lvl>
+    <w:lvl w:ilvl="8" w:tplc="0409001B" w:tentative="1">
+      <w:start w:val="1"/>
+      <w:numFmt w:val="lowerRoman"/>
+      <w:lvlText w:val="%9."/>
+      <w:lvlJc w:val="right"/>
+      <w:pPr>
+        <w:ind w:left="6480" w:hanging="180"/>
+      </w:pPr>
+    </w:lvl>
+  </w:abstractNum>
+  <w:abstractNum w:abstractNumId="4" w15:restartNumberingAfterBreak="0">
     <w:nsid w:val="570B0007"/>
     <w:multiLevelType w:val="hybridMultilevel"/>
     <w:tmpl w:val="BE80CEDA"/>
@@ -1065,7 +1407,7 @@
       </w:pPr>
     </w:lvl>
   </w:abstractNum>
-  <w:abstractNum w:abstractNumId="3" w15:restartNumberingAfterBreak="0">
+  <w:abstractNum w:abstractNumId="5" w15:restartNumberingAfterBreak="0">
     <w:nsid w:val="63B61B9F"/>
     <w:multiLevelType w:val="hybridMultilevel"/>
     <w:tmpl w:val="8A52F65C"/>
@@ -1154,7 +1496,7 @@
       </w:pPr>
     </w:lvl>
   </w:abstractNum>
-  <w:abstractNum w:abstractNumId="4" w15:restartNumberingAfterBreak="0">
+  <w:abstractNum w:abstractNumId="6" w15:restartNumberingAfterBreak="0">
     <w:nsid w:val="6D563D3E"/>
     <w:multiLevelType w:val="hybridMultilevel"/>
     <w:tmpl w:val="F92C9E2A"/>
@@ -1243,20 +1585,120 @@
       </w:pPr>
     </w:lvl>
   </w:abstractNum>
+  <w:abstractNum w:abstractNumId="7" w15:restartNumberingAfterBreak="0">
+    <w:nsid w:val="71A21F56"/>
+    <w:multiLevelType w:val="hybridMultilevel"/>
+    <w:tmpl w:val="20B4DAF2"/>
+    <w:lvl w:ilvl="0" w:tplc="5AC4A3DE">
+      <w:start w:val="1"/>
+      <w:numFmt w:val="decimal"/>
+      <w:lvlText w:val="%1-"/>
+      <w:lvlJc w:val="left"/>
+      <w:pPr>
+        <w:ind w:left="720" w:hanging="360"/>
+      </w:pPr>
+      <w:rPr>
+        <w:rFonts w:asciiTheme="minorBidi" w:eastAsia="Times New Roman" w:hAnsiTheme="minorBidi" w:hint="default"/>
+        <w:color w:val="36464E"/>
+        <w:sz w:val="28"/>
+      </w:rPr>
+    </w:lvl>
+    <w:lvl w:ilvl="1" w:tplc="04090019" w:tentative="1">
+      <w:start w:val="1"/>
+      <w:numFmt w:val="lowerLetter"/>
+      <w:lvlText w:val="%2."/>
+      <w:lvlJc w:val="left"/>
+      <w:pPr>
+        <w:ind w:left="1440" w:hanging="360"/>
+      </w:pPr>
+    </w:lvl>
+    <w:lvl w:ilvl="2" w:tplc="0409001B" w:tentative="1">
+      <w:start w:val="1"/>
+      <w:numFmt w:val="lowerRoman"/>
+      <w:lvlText w:val="%3."/>
+      <w:lvlJc w:val="right"/>
+      <w:pPr>
+        <w:ind w:left="2160" w:hanging="180"/>
+      </w:pPr>
+    </w:lvl>
+    <w:lvl w:ilvl="3" w:tplc="0409000F" w:tentative="1">
+      <w:start w:val="1"/>
+      <w:numFmt w:val="decimal"/>
+      <w:lvlText w:val="%4."/>
+      <w:lvlJc w:val="left"/>
+      <w:pPr>
+        <w:ind w:left="2880" w:hanging="360"/>
+      </w:pPr>
+    </w:lvl>
+    <w:lvl w:ilvl="4" w:tplc="04090019" w:tentative="1">
+      <w:start w:val="1"/>
+      <w:numFmt w:val="lowerLetter"/>
+      <w:lvlText w:val="%5."/>
+      <w:lvlJc w:val="left"/>
+      <w:pPr>
+        <w:ind w:left="3600" w:hanging="360"/>
+      </w:pPr>
+    </w:lvl>
+    <w:lvl w:ilvl="5" w:tplc="0409001B" w:tentative="1">
+      <w:start w:val="1"/>
+      <w:numFmt w:val="lowerRoman"/>
+      <w:lvlText w:val="%6."/>
+      <w:lvlJc w:val="right"/>
+      <w:pPr>
+        <w:ind w:left="4320" w:hanging="180"/>
+      </w:pPr>
+    </w:lvl>
+    <w:lvl w:ilvl="6" w:tplc="0409000F" w:tentative="1">
+      <w:start w:val="1"/>
+      <w:numFmt w:val="decimal"/>
+      <w:lvlText w:val="%7."/>
+      <w:lvlJc w:val="left"/>
+      <w:pPr>
+        <w:ind w:left="5040" w:hanging="360"/>
+      </w:pPr>
+    </w:lvl>
+    <w:lvl w:ilvl="7" w:tplc="04090019" w:tentative="1">
+      <w:start w:val="1"/>
+      <w:numFmt w:val="lowerLetter"/>
+      <w:lvlText w:val="%8."/>
+      <w:lvlJc w:val="left"/>
+      <w:pPr>
+        <w:ind w:left="5760" w:hanging="360"/>
+      </w:pPr>
+    </w:lvl>
+    <w:lvl w:ilvl="8" w:tplc="0409001B" w:tentative="1">
+      <w:start w:val="1"/>
+      <w:numFmt w:val="lowerRoman"/>
+      <w:lvlText w:val="%9."/>
+      <w:lvlJc w:val="right"/>
+      <w:pPr>
+        <w:ind w:left="6480" w:hanging="180"/>
+      </w:pPr>
+    </w:lvl>
+  </w:abstractNum>
   <w:num w:numId="1">
-    <w:abstractNumId w:val="2"/>
+    <w:abstractNumId w:val="4"/>
   </w:num>
   <w:num w:numId="2">
-    <w:abstractNumId w:val="4"/>
+    <w:abstractNumId w:val="6"/>
   </w:num>
   <w:num w:numId="3">
-    <w:abstractNumId w:val="3"/>
+    <w:abstractNumId w:val="5"/>
   </w:num>
   <w:num w:numId="4">
     <w:abstractNumId w:val="0"/>
   </w:num>
   <w:num w:numId="5">
     <w:abstractNumId w:val="1"/>
+  </w:num>
+  <w:num w:numId="6">
+    <w:abstractNumId w:val="7"/>
+  </w:num>
+  <w:num w:numId="7">
+    <w:abstractNumId w:val="3"/>
+  </w:num>
+  <w:num w:numId="8">
+    <w:abstractNumId w:val="2"/>
   </w:num>
 </w:numbering>
 </file>
@@ -1654,6 +2096,7 @@
   <w:style w:type="paragraph" w:default="1" w:styleId="Normal">
     <w:name w:val="Normal"/>
     <w:qFormat/>
+    <w:rsid w:val="00F659D7"/>
   </w:style>
   <w:style w:type="paragraph" w:styleId="Heading1">
     <w:name w:val="heading 1"/>

</xml_diff>